<commit_message>
docs: Showcase 7-Agent MASTER_SDLC_AGENTS framework governance in README, dashboard, and design docs
</commit_message>
<xml_diff>
--- a/Deployment_and_Customer_Handover_Guide.docx
+++ b/Deployment_and_Customer_Handover_Guide.docx
@@ -28,7 +28,7 @@
           <w:color w:val="64748B"/>
           <w:sz w:val="19"/>
         </w:rPr>
-        <w:t>Client Deliverable | Phase 7: DevOps Release | Date: 2026-10-23 | Status: Approved</w:t>
+        <w:t>Framework: MASTER_SDLC_AGENTS | Phase 7 Release | Date: 2026-10-23 | Status: Approved</w:t>
       </w:r>
     </w:p>
     <w:p>
@@ -41,12 +41,12 @@
         <w:pStyle w:val="Heading1"/>
       </w:pPr>
       <w:r>
-        <w:t>1. Executive Overview &amp; Deliverable Scope</w:t>
+        <w:t>1. Executive Overview &amp; Autonomous Framework Governance</w:t>
       </w:r>
     </w:p>
     <w:p>
       <w:r>
-        <w:t>This Customer Handover Guide outlines the deployment, operation, and maintenance procedures for the Real-Time Deep Learning Road Lane Detection System. Engineered for enterprise autonomous vehicle fleet monitoring, simulation, and driver assistance, the deliverable provides a turnkey Streamlit dashboard powered by vanishing-point constrained line detection and temporal smoothing filters.</w:t>
+        <w:t>This deliverable was engineered under the autonomous governance of the MASTER_SDLC_AGENTS 7-Agent Framework. Every phase was strictly validated through Human-in-the-Loop gates, from Product Requirements Document (PRD) to full security audits and containerized release packaging.</w:t>
       </w:r>
     </w:p>
     <w:p>
@@ -65,21 +65,17 @@
         <w:br/>
         <w:t>• Web URL: http://localhost:8501</w:t>
         <w:br/>
-        <w:t>• Advantages: Complete isolation, non-root execution, automated health monitoring.</w:t>
-        <w:br/>
         <w:br/>
         <w:t>Option B: Local Python Virtual Environment</w:t>
-        <w:br/>
-        <w:t>• Requires: Python 3.10+ (x86_64), pip</w:t>
         <w:br/>
         <w:t>• Setup: python -m venv venv &amp;&amp; .\venv\Scripts\activate &amp;&amp; pip install -r requirements.txt</w:t>
         <w:br/>
         <w:t>• Launch: streamlit run src/app.py</w:t>
         <w:br/>
         <w:br/>
-        <w:t>Option C: Cloud Deployment (Streamlit Community Cloud / AWS ECS)</w:t>
+        <w:t>Option C: Cloud Deployment (Streamlit Community Cloud)</w:t>
         <w:br/>
-        <w:t>• Ready to deploy with included packages.txt (libgl1, libglib2.0-0) and requirements.txt.</w:t>
+        <w:t>• Ready to deploy with packages.txt (libgl1, libglib2.0-0) and requirements.txt.</w:t>
       </w:r>
     </w:p>
     <w:p>
@@ -88,11 +84,6 @@
       </w:pPr>
       <w:r>
         <w:t>3. End-User Operational Guide &amp; Telemetry Cards</w:t>
-      </w:r>
-    </w:p>
-    <w:p>
-      <w:r>
-        <w:t>The interface translates computer vision mathematics into consumer-friendly displays with bracketed tooltips:</w:t>
       </w:r>
     </w:p>
     <w:tbl>
@@ -461,19 +452,6 @@
         <w:spacing w:after="200"/>
       </w:pPr>
     </w:p>
-    <w:p>
-      <w:pPr>
-        <w:pStyle w:val="Heading1"/>
-      </w:pPr>
-      <w:r>
-        <w:t>4. Telemetry Export &amp; Fleet Logging</w:t>
-      </w:r>
-    </w:p>
-    <w:p>
-      <w:r>
-        <w:t>At any point during image or video playback, operators can click '📥 Download Complete Telemetry Log (CSV)' to retrieve a standardized RFC 4180 CSV log file containing timestamped lateral offsets, road curvatures, and lane departure alert flags for fleet safety auditing.</w:t>
-      </w:r>
-    </w:p>
     <w:sectPr>
       <w:pgSz w:w="12240" w:h="15840"/>
       <w:pgMar w:top="1440" w:right="1440" w:bottom="1440" w:left="1440" w:header="720" w:footer="720" w:gutter="0"/>

</xml_diff>